<commit_message>
docs: record Azure Functions 3.9.0 deployment acceptance
</commit_message>
<xml_diff>
--- a/jackyun-portal/docs/azure-functions-3.9.0-release-and-acceptance.docx
+++ b/jackyun-portal/docs/azure-functions-3.9.0-release-and-acceptance.docx
@@ -152,6 +152,68 @@
     <w:p>
       <w:r>
         <w:t>在专用数据库身份、备份恢复演练、真实认证读写、跨设备冲突/回滚验收以及可审计哈希证据齐备前，不执行 azure/sync-v5.sql，不设置账号或资源灰度，也不宣称 v5 已投入生产。</w:t>
+      </w:r>
+    </w:p>
+    <w:p>
+      <w:pPr>
+        <w:pStyle w:val="Heading1"/>
+      </w:pPr>
+      <w:r>
+        <w:t>实际部署结果与接口验收</w:t>
+      </w:r>
+    </w:p>
+    <w:p>
+      <w:r>
+        <w:t>2026 年 10 月 26 日，在 Azure Functions Core Tools 4.16.0 发布后，对生产 Function App jackyun-sync-9d26b2cc 进行只读验证。以下结果只证明后端部署与 HTTP 路由状态，不代表数据库迁移或用户数据同步验收。</w:t>
+      </w:r>
+    </w:p>
+    <w:p>
+      <w:pPr>
+        <w:pStyle w:val="Heading2"/>
+      </w:pPr>
+      <w:r>
+        <w:t>已验证结果</w:t>
+      </w:r>
+    </w:p>
+    <w:p>
+      <w:r>
+        <w:t>GET https://jackyun-sync-9d26b2cc.azurewebsites.net/health/live 返回 HTTP 200。响应报告 ok=true、version=3.9.0、syncProtocol=5、transferEncoding=gzip、legacyEncoding=identity。此次请求 ID 为 d5b8d0ea-af1c-461f-bbe1-49cbd62e84ec。</w:t>
+      </w:r>
+    </w:p>
+    <w:p>
+      <w:r>
+        <w:t>对 /api/sync/v5/manifest 发起不带凭据的 GET，返回 HTTP 401 UNAUTHORIZED，requestId 为 6d0838b0-e4af-4a44-97c7-736626abe0b5，而不是之前的 404。这证明生产 HTTP 入口已将 v5 manifest 路由交给认证处理；由于请求未认证，不能据此证明已完成 v5 数据读写。</w:t>
+      </w:r>
+    </w:p>
+    <w:p>
+      <w:pPr>
+        <w:pStyle w:val="Heading2"/>
+      </w:pPr>
+      <w:r>
+        <w:t>灰度与数据安全边界</w:t>
+      </w:r>
+    </w:p>
+    <w:p>
+      <w:r>
+        <w:t>发布命令没有使用本地设置发布、仅发布设置或覆盖设置参数；没有修改 Azure 应用设置，也没有执行 PostgreSQL schema 迁移。部署前检查未发现 SYNC_V5_USERS 或 SYNC_V5_SCOPES 设置。v5 仍按默认关闭策略处理，本次发布不构成灰度启用。</w:t>
+      </w:r>
+    </w:p>
+    <w:p>
+      <w:r>
+        <w:t>本次没有读取数据库密码或 Key Vault secret，没有执行数据库写入，也没有使用专用测试账号。因此数据库迁移状态、认证后 manifest/records/operations/receipts 读写、回执重读哈希、备份恢复、手机与电脑双向同步、冲突及回滚均未验证。生产端到端验收须在隔离测试账号和批准的数据库凭据准备后单独执行。</w:t>
+      </w:r>
+    </w:p>
+    <w:p>
+      <w:pPr>
+        <w:pStyle w:val="Heading2"/>
+      </w:pPr>
+      <w:r>
+        <w:t>结论</w:t>
+      </w:r>
+    </w:p>
+    <w:p>
+      <w:r>
+        <w:t>Azure Functions 生产运行版本已从 3.7.0 更新至 3.9.0，健康端点版本与代码版本一致，v5 manifest 路由已到达认证层。后端部署这一阶段通过；v5 生产启用仍未获准，直至数据库迁移演练和认证后的真实读写及跨设备验收完成。</w:t>
       </w:r>
     </w:p>
     <w:sectPr>

</xml_diff>